<commit_message>
feat(render): industry context section in outputs (plan step 20) (#1)
Step 20 implemented by the coder agent and finished after review and a
visual check: every AI-chosen phrase ("Supported out of the box" etc.)
now appears with its verbatim quote in every format, slides included,
on a dedicated Industry context layout; citations are never rewritten by
the anonymiser (a client's own site as source is dropped instead); the
audit row records which research fed an output; research text is shown
never to reach case records. Completes Phase 4.

Co-Authored-By: Claude Opus 5.5 <noreply@anthropic.com>
Claude-Session: https://claude.ai/code/session_01MPRoCfbJuTDz6tit2f4eFM
</commit_message>
<xml_diff>
--- a/brand/reference.docx
+++ b/brand/reference.docx
@@ -106,6 +106,66 @@
     <w:p>
       <w:r>
         <w:t>{%p endfor %}</w:t>
+      </w:r>
+    </w:p>
+    <w:p>
+      <w:r>
+        <w:t>{%p if industry %}</w:t>
+      </w:r>
+    </w:p>
+    <w:p>
+      <w:pPr>
+        <w:pStyle w:val="Heading1"/>
+        <w:pageBreakBefore/>
+      </w:pPr>
+      <w:r>
+        <w:t>{{ industry.heading }}</w:t>
+      </w:r>
+    </w:p>
+    <w:p>
+      <w:r>
+        <w:rPr>
+          <w:i/>
+        </w:rPr>
+        <w:t>{{ industry.disclaimer }}</w:t>
+      </w:r>
+    </w:p>
+    <w:p>
+      <w:r>
+        <w:t>{%p for i in industry.statements %}</w:t>
+      </w:r>
+    </w:p>
+    <w:p>
+      <w:pPr>
+        <w:pStyle w:val="ListBullet"/>
+      </w:pPr>
+      <w:r>
+        <w:t>{{ i.text }}</w:t>
+      </w:r>
+    </w:p>
+    <w:p>
+      <w:r>
+        <w:t>{%p endfor %}</w:t>
+      </w:r>
+    </w:p>
+    <w:p>
+      <w:r>
+        <w:t>{%p if industry.note %}</w:t>
+      </w:r>
+    </w:p>
+    <w:p>
+      <w:r>
+        <w:t>{{ industry.note }}</w:t>
+      </w:r>
+    </w:p>
+    <w:p>
+      <w:r>
+        <w:t>{%p endif %}</w:t>
+      </w:r>
+    </w:p>
+    <w:p>
+      <w:r>
+        <w:t>{%p endif %}</w:t>
       </w:r>
     </w:p>
     <w:sectPr>

</xml_diff>

<commit_message>
feat(render): engagement note in review and all outputs (plan #52 step 6) (#52)
Co-Authored-By: Claude Opus 5.5 <noreply@anthropic.com>
Claude-Session: https://claude.ai/code/session_01MPRoCfbJuTDz6tit2f4eFM
</commit_message>
<xml_diff>
--- a/brand/reference.docx
+++ b/brand/reference.docx
@@ -22,6 +22,21 @@
           <w:i/>
         </w:rPr>
         <w:t>{{ c.client }}</w:t>
+      </w:r>
+    </w:p>
+    <w:p>
+      <w:r>
+        <w:t>{%p if c.note %}</w:t>
+      </w:r>
+    </w:p>
+    <w:p>
+      <w:r>
+        <w:t>{{ c.note }}</w:t>
+      </w:r>
+    </w:p>
+    <w:p>
+      <w:r>
+        <w:t>{%p endif %}</w:t>
       </w:r>
     </w:p>
     <w:p>

</xml_diff>

<commit_message>
feat(render): diagrams with captions in Word (plan #200 step 11) (#200)
Co-Authored-By: Claude Sonnet 5.5 <noreply@anthropic.com>
Co-Authored-By: Claude Opus 5.5 <noreply@anthropic.com>
Claude-Session: https://claude.ai/code/session_01MPRoCfbJuTDz6tit2f4eFM
</commit_message>
<xml_diff>
--- a/brand/reference.docx
+++ b/brand/reference.docx
@@ -111,6 +111,29 @@
     <w:p>
       <w:r>
         <w:t>{%p endfor %}</w:t>
+      </w:r>
+    </w:p>
+    <w:p>
+      <w:r>
+        <w:t>{%p endfor %}</w:t>
+      </w:r>
+    </w:p>
+    <w:p>
+      <w:r>
+        <w:t>{%p for d in c.diagrams %}</w:t>
+      </w:r>
+    </w:p>
+    <w:p>
+      <w:r>
+        <w:t>{{ d.image }}</w:t>
+      </w:r>
+    </w:p>
+    <w:p>
+      <w:pPr>
+        <w:pStyle w:val="Caption"/>
+      </w:pPr>
+      <w:r>
+        <w:t>{{ d.caption }}</w:t>
       </w:r>
     </w:p>
     <w:p>

</xml_diff>

<commit_message>
feat(brand): Word template renders grouped quotes and a numbered source list (plan #214 step 7) (#214)
Co-Authored-By: Claude Opus 5.5 <noreply@anthropic.com>
Claude-Session: https://claude.ai/code/session_01MPRoCfbJuTDz6tit2f4eFM
</commit_message>
<xml_diff>
--- a/brand/reference.docx
+++ b/brand/reference.docx
@@ -170,7 +170,28 @@
     </w:p>
     <w:p>
       <w:r>
-        <w:t>{%p for i in industry.statements %}</w:t>
+        <w:t>{%p for g in industry.groups %}</w:t>
+      </w:r>
+    </w:p>
+    <w:p>
+      <w:pPr>
+        <w:pStyle w:val="Heading2"/>
+      </w:pPr>
+      <w:r>
+        <w:t>{{ g.title }}</w:t>
+      </w:r>
+    </w:p>
+    <w:p>
+      <w:r>
+        <w:rPr>
+          <w:i/>
+        </w:rPr>
+        <w:t>{{ g.lead }}</w:t>
+      </w:r>
+    </w:p>
+    <w:p>
+      <w:r>
+        <w:t>{%p for q in g.quotes %}</w:t>
       </w:r>
     </w:p>
     <w:p>
@@ -178,7 +199,35 @@
         <w:pStyle w:val="ListBullet"/>
       </w:pPr>
       <w:r>
-        <w:t>{{ i.text }}</w:t>
+        <w:t>“{{ q.quote }}” [{{ q.n }}]</w:t>
+      </w:r>
+    </w:p>
+    <w:p>
+      <w:r>
+        <w:t>{%p endfor %}</w:t>
+      </w:r>
+    </w:p>
+    <w:p>
+      <w:r>
+        <w:t>{%p endfor %}</w:t>
+      </w:r>
+    </w:p>
+    <w:p>
+      <w:pPr>
+        <w:pStyle w:val="Heading2"/>
+      </w:pPr>
+      <w:r>
+        <w:t>Sources</w:t>
+      </w:r>
+    </w:p>
+    <w:p>
+      <w:r>
+        <w:t>{%p for s in industry.sources %}</w:t>
+      </w:r>
+    </w:p>
+    <w:p>
+      <w:r>
+        <w:t>[{{ s.n }}] {{ s.title }}, {{ s.publisher }}, {{ s.url }}, retrieved {{ s.date }}</w:t>
       </w:r>
     </w:p>
     <w:p>

</xml_diff>

<commit_message>
fix(render): strict Markdown autolinks, escaped dates, no empty Sources heading, malformed URLs; tests (plan #214 deviation, review) (#214)
Co-Authored-By: Claude Opus 5.5 <noreply@anthropic.com>
Claude-Session: https://claude.ai/code/session_01MPRoCfbJuTDz6tit2f4eFM
</commit_message>
<xml_diff>
--- a/brand/reference.docx
+++ b/brand/reference.docx
@@ -213,6 +213,11 @@
       </w:r>
     </w:p>
     <w:p>
+      <w:r>
+        <w:t>{%p if industry.sources %}</w:t>
+      </w:r>
+    </w:p>
+    <w:p>
       <w:pPr>
         <w:pStyle w:val="Heading2"/>
       </w:pPr>
@@ -233,6 +238,11 @@
     <w:p>
       <w:r>
         <w:t>{%p endfor %}</w:t>
+      </w:r>
+    </w:p>
+    <w:p>
+      <w:r>
+        <w:t>{%p endif %}</w:t>
       </w:r>
     </w:p>
     <w:p>

</xml_diff>

<commit_message>
feat(brand): bid template renders paragraphs; case-study template (cover, at a glance, sections, architecture, references) (plan #212 step E2) (#212)
Co-Authored-By: Claude Opus 5.5 <noreply@anthropic.com>
Claude-Session: https://claude.ai/code/session_01MPRoCfbJuTDz6tit2f4eFM
</commit_message>
<xml_diff>
--- a/brand/reference.docx
+++ b/brand/reference.docx
@@ -74,7 +74,17 @@
     </w:p>
     <w:p>
       <w:r>
-        <w:t>{{ b.text }}</w:t>
+        <w:t>{%p for p in b.paragraphs %}</w:t>
+      </w:r>
+    </w:p>
+    <w:p>
+      <w:r>
+        <w:t>{{ p }}</w:t>
+      </w:r>
+    </w:p>
+    <w:p>
+      <w:r>
+        <w:t>{%p endfor %}</w:t>
       </w:r>
     </w:p>
     <w:p>

</xml_diff>

<commit_message>
feat(render): Our capability section in bid packs and Markdown, case-study and slide formats refuse capability (plan #213 step 4) (#213)
Co-Authored-By: Claude Opus 5.5 <noreply@anthropic.com>
Claude-Session: https://claude.ai/code/session_01MPRoCfbJuTDz6tit2f4eFM
</commit_message>
<xml_diff>
--- a/brand/reference.docx
+++ b/brand/reference.docx
@@ -9,7 +9,47 @@
     </w:p>
     <w:p>
       <w:r>
+        <w:t>{%p if c.group %}</w:t>
+      </w:r>
+    </w:p>
+    <w:p>
+      <w:pPr>
+        <w:pStyle w:val="Heading1"/>
+        <w:pageBreakBefore/>
+      </w:pPr>
+      <w:r>
+        <w:t>{{ c.group }}</w:t>
+      </w:r>
+    </w:p>
+    <w:p>
+      <w:r>
         <w:t>{%p if c.logo %}</w:t>
+      </w:r>
+    </w:p>
+    <w:p>
+      <w:pPr>
+        <w:jc w:val="right"/>
+      </w:pPr>
+      <w:r>
+        <w:t>{{ c.logo }}</w:t>
+      </w:r>
+    </w:p>
+    <w:p>
+      <w:r>
+        <w:t>{%p endif %}</w:t>
+      </w:r>
+    </w:p>
+    <w:p>
+      <w:pPr>
+        <w:pStyle w:val="Heading1"/>
+      </w:pPr>
+      <w:r>
+        <w:t>{{ c.title }}</w:t>
+      </w:r>
+    </w:p>
+    <w:p>
+      <w:r>
+        <w:t>{%p elif c.logo %}</w:t>
       </w:r>
     </w:p>
     <w:p>

</xml_diff>

<commit_message>
fix(logos): one fail-closed masking rule for cards, outputs and the public route; delete and worker outcomes audited (plan #267 deviation, Opus + Codex review) (#267)
Co-Authored-By: Claude Opus 5.5 <noreply@anthropic.com>
Claude-Session: https://claude.ai/code/session_01MPRoCfbJuTDz6tit2f4eFM
</commit_message>
<xml_diff>
--- a/brand/reference.docx
+++ b/brand/reference.docx
@@ -8,12 +8,44 @@
       </w:r>
     </w:p>
     <w:p>
+      <w:r>
+        <w:t>{%p if c.logo %}</w:t>
+      </w:r>
+    </w:p>
+    <w:p>
+      <w:pPr>
+        <w:pageBreakBefore/>
+        <w:jc w:val="right"/>
+      </w:pPr>
+      <w:r>
+        <w:t>{{ c.logo }}</w:t>
+      </w:r>
+    </w:p>
+    <w:p>
+      <w:pPr>
+        <w:pStyle w:val="Heading1"/>
+      </w:pPr>
+      <w:r>
+        <w:t>{{ c.title }}</w:t>
+      </w:r>
+    </w:p>
+    <w:p>
+      <w:r>
+        <w:t>{%p else %}</w:t>
+      </w:r>
+    </w:p>
+    <w:p>
       <w:pPr>
         <w:pStyle w:val="Heading1"/>
         <w:pageBreakBefore/>
       </w:pPr>
       <w:r>
-        <w:t>{{ c.title }}{% if c.logo %}  {{ c.logo }}{% endif %}</w:t>
+        <w:t>{{ c.title }}</w:t>
+      </w:r>
+    </w:p>
+    <w:p>
+      <w:r>
+        <w:t>{%p endif %}</w:t>
       </w:r>
     </w:p>
     <w:p>

</xml_diff>